<commit_message>
Word is awful and I hate it with a burning passion.
MS Word is genuinely awful clunky software and I do not understand why Google Docs, which has equivalent if not better version control, cannot be used.
</commit_message>
<xml_diff>
--- a/uni-coversheet.docx
+++ b/uni-coversheet.docx
@@ -6,13 +6,7 @@
       <w:pPr>
         <w:spacing w:after="0" w:line="240" w:lineRule="auto"/>
         <w:rPr>
-          <w:rFonts w:ascii="Times New Roman" w:eastAsia="MS Mincho" w:hAnsi="Times New Roman" w:cs="Times New Roman"/>
-          <w:color w:val="000000" w:themeColor="text1"/>
-          <w:kern w:val="0"/>
-          <w:sz w:val="24"/>
-          <w:szCs w:val="24"/>
           <w:lang w:val="en-US"/>
-          <w14:ligatures w14:val="none"/>
         </w:rPr>
       </w:pPr>
       <w:r>
@@ -475,7 +469,25 @@
                 <w:bCs/>
                 <w:kern w:val="0"/>
               </w:rPr>
-              <w:t>I give consent for my work to be used as an exemplar to future students.</w:t>
+              <w:t xml:space="preserve">I give consent for my work to be used as an </w:t>
+            </w:r>
+            <w:proofErr w:type="gramStart"/>
+            <w:r>
+              <w:rPr>
+                <w:rFonts w:ascii="Times New Roman" w:eastAsia="MS Mincho" w:hAnsi="Times New Roman" w:cs="Times New Roman"/>
+                <w:bCs/>
+                <w:kern w:val="0"/>
+              </w:rPr>
+              <w:t>exemplar</w:t>
+            </w:r>
+            <w:proofErr w:type="gramEnd"/>
+            <w:r>
+              <w:rPr>
+                <w:rFonts w:ascii="Times New Roman" w:eastAsia="MS Mincho" w:hAnsi="Times New Roman" w:cs="Times New Roman"/>
+                <w:bCs/>
+                <w:kern w:val="0"/>
+              </w:rPr>
+              <w:t xml:space="preserve"> to future students.</w:t>
             </w:r>
           </w:p>
         </w:tc>
@@ -611,7 +623,55 @@
                 <w:rFonts w:ascii="Times New Roman" w:eastAsia="MS Mincho" w:hAnsi="Times New Roman" w:cs="Times New Roman"/>
                 <w:kern w:val="0"/>
               </w:rPr>
-              <w:t xml:space="preserve">Link to version-controlled file (i.e on OneDrive, Google Docs, Github, or other) which contain evidence of the process I undertook to complete this assignment. </w:t>
+              <w:t xml:space="preserve">Link to version-controlled </w:t>
+            </w:r>
+            <w:proofErr w:type="gramStart"/>
+            <w:r>
+              <w:rPr>
+                <w:rFonts w:ascii="Times New Roman" w:eastAsia="MS Mincho" w:hAnsi="Times New Roman" w:cs="Times New Roman"/>
+                <w:kern w:val="0"/>
+              </w:rPr>
+              <w:t>file</w:t>
+            </w:r>
+            <w:proofErr w:type="gramEnd"/>
+            <w:r>
+              <w:rPr>
+                <w:rFonts w:ascii="Times New Roman" w:eastAsia="MS Mincho" w:hAnsi="Times New Roman" w:cs="Times New Roman"/>
+                <w:kern w:val="0"/>
+              </w:rPr>
+              <w:t xml:space="preserve"> (</w:t>
+            </w:r>
+            <w:proofErr w:type="spellStart"/>
+            <w:r>
+              <w:rPr>
+                <w:rFonts w:ascii="Times New Roman" w:eastAsia="MS Mincho" w:hAnsi="Times New Roman" w:cs="Times New Roman"/>
+                <w:kern w:val="0"/>
+              </w:rPr>
+              <w:t>i.e</w:t>
+            </w:r>
+            <w:proofErr w:type="spellEnd"/>
+            <w:r>
+              <w:rPr>
+                <w:rFonts w:ascii="Times New Roman" w:eastAsia="MS Mincho" w:hAnsi="Times New Roman" w:cs="Times New Roman"/>
+                <w:kern w:val="0"/>
+              </w:rPr>
+              <w:t xml:space="preserve"> on OneDrive, Google Docs, </w:t>
+            </w:r>
+            <w:proofErr w:type="spellStart"/>
+            <w:r>
+              <w:rPr>
+                <w:rFonts w:ascii="Times New Roman" w:eastAsia="MS Mincho" w:hAnsi="Times New Roman" w:cs="Times New Roman"/>
+                <w:kern w:val="0"/>
+              </w:rPr>
+              <w:t>Github</w:t>
+            </w:r>
+            <w:proofErr w:type="spellEnd"/>
+            <w:r>
+              <w:rPr>
+                <w:rFonts w:ascii="Times New Roman" w:eastAsia="MS Mincho" w:hAnsi="Times New Roman" w:cs="Times New Roman"/>
+                <w:kern w:val="0"/>
+              </w:rPr>
+              <w:t xml:space="preserve">, or other) which contain evidence of the process I undertook to complete this assignment. </w:t>
             </w:r>
             <w:r>
               <w:rPr>
@@ -621,7 +681,7 @@
               <w:br/>
               <w:t xml:space="preserve">Information on how to create a Microsoft 365 OneDrive folder is available </w:t>
             </w:r>
-            <w:hyperlink r:id="rId5">
+            <w:hyperlink r:id="rId7">
               <w:r>
                 <w:rPr>
                   <w:rStyle w:val="Hyperlink"/>
@@ -670,7 +730,7 @@
                 <w:bCs/>
               </w:rPr>
             </w:pPr>
-            <w:hyperlink r:id="rId6" w:history="1">
+            <w:hyperlink r:id="rId8" w:history="1">
               <w:r>
                 <w:rPr>
                   <w:rStyle w:val="Hyperlink"/>
@@ -828,7 +888,7 @@
                 <w:rFonts w:ascii="Times New Roman" w:hAnsi="Times New Roman"/>
                 <w:bCs/>
               </w:rPr>
-              <w:t>N/A</w:t>
+              <w:t>The marking scheme mentioned references. Exactly what was I to reference?</w:t>
             </w:r>
           </w:p>
         </w:tc>
@@ -951,7 +1011,7 @@
           <w14:ligatures w14:val="none"/>
         </w:rPr>
       </w:pPr>
-      <w:hyperlink r:id="rId7">
+      <w:hyperlink r:id="rId9">
         <w:r>
           <w:rPr>
             <w:rStyle w:val="Hyperlink"/>
@@ -994,7 +1054,7 @@
         </w:rPr>
         <w:t xml:space="preserve">For more information, please see the Coversheet </w:t>
       </w:r>
-      <w:hyperlink r:id="rId8">
+      <w:hyperlink r:id="rId10">
         <w:r>
           <w:rPr>
             <w:rStyle w:val="Hyperlink"/>
@@ -1021,22 +1081,67 @@
         <w:t xml:space="preserve">. </w:t>
       </w:r>
     </w:p>
-    <w:p>
-      <w:pPr>
-        <w:rPr>
-          <w:lang w:val="en-US"/>
-        </w:rPr>
-      </w:pPr>
-    </w:p>
     <w:sectPr>
       <w:pgSz w:w="11906" w:h="16838"/>
       <w:pgMar w:top="1440" w:right="1440" w:bottom="1440" w:left="1440" w:header="0" w:footer="0" w:gutter="0"/>
+      <w:pgNumType w:start="1"/>
       <w:cols w:space="720"/>
       <w:formProt w:val="0"/>
+      <w:titlePg/>
       <w:docGrid w:linePitch="360" w:charSpace="4096"/>
     </w:sectPr>
   </w:body>
 </w:document>
+</file>
+
+<file path=word/endnotes.xml><?xml version="1.0" encoding="utf-8"?>
+<w:endnotes xmlns:wpc="http://schemas.microsoft.com/office/word/2010/wordprocessingCanvas" xmlns:cx="http://schemas.microsoft.com/office/drawing/2014/chartex" xmlns:cx1="http://schemas.microsoft.com/office/drawing/2015/9/8/chartex" xmlns:cx2="http://schemas.microsoft.com/office/drawing/2015/10/21/chartex" xmlns:cx3="http://schemas.microsoft.com/office/drawing/2016/5/9/chartex" xmlns:cx4="http://schemas.microsoft.com/office/drawing/2016/5/10/chartex" xmlns:cx5="http://schemas.microsoft.com/office/drawing/2016/5/11/chartex" xmlns:cx6="http://schemas.microsoft.com/office/drawing/2016/5/12/chartex" xmlns:cx7="http://schemas.microsoft.com/office/drawing/2016/5/13/chartex" xmlns:cx8="http://schemas.microsoft.com/office/drawing/2016/5/14/chartex" xmlns:mc="http://schemas.openxmlformats.org/markup-compatibility/2006" xmlns:aink="http://schemas.microsoft.com/office/drawing/2016/ink" xmlns:am3d="http://schemas.microsoft.com/office/drawing/2017/model3d" xmlns:o="urn:schemas-microsoft-com:office:office" xmlns:oel="http://schemas.microsoft.com/office/2019/extlst" xmlns:r="http://schemas.openxmlformats.org/officeDocument/2006/relationships" xmlns:m="http://schemas.openxmlformats.org/officeDocument/2006/math" xmlns:v="urn:schemas-microsoft-com:vml" xmlns:wp14="http://schemas.microsoft.com/office/word/2010/wordprocessingDrawing" xmlns:wp="http://schemas.openxmlformats.org/drawingml/2006/wordprocessingDrawing" xmlns:w10="urn:schemas-microsoft-com:office:word" xmlns:w="http://schemas.openxmlformats.org/wordprocessingml/2006/main" xmlns:w14="http://schemas.microsoft.com/office/word/2010/wordml" xmlns:w15="http://schemas.microsoft.com/office/word/2012/wordml" xmlns:w16cex="http://schemas.microsoft.com/office/word/2018/wordml/cex" xmlns:w16cid="http://schemas.microsoft.com/office/word/2016/wordml/cid" xmlns:w16="http://schemas.microsoft.com/office/word/2018/wordml" xmlns:w16du="http://schemas.microsoft.com/office/word/2023/wordml/word16du" xmlns:w16sdtdh="http://schemas.microsoft.com/office/word/2020/wordml/sdtdatahash" xmlns:w16sdtfl="http://schemas.microsoft.com/office/word/2024/wordml/sdtformatlock" xmlns:w16se="http://schemas.microsoft.com/office/word/2015/wordml/symex" xmlns:wpg="http://schemas.microsoft.com/office/word/2010/wordprocessingGroup" xmlns:wpi="http://schemas.microsoft.com/office/word/2010/wordprocessingInk" xmlns:wne="http://schemas.microsoft.com/office/word/2006/wordml" xmlns:wps="http://schemas.microsoft.com/office/word/2010/wordprocessingShape" mc:Ignorable="w14 w15 w16se w16cid w16 w16cex w16sdtdh w16sdtfl w16du wp14">
+  <w:endnote w:type="separator" w:id="-1">
+    <w:p>
+      <w:pPr>
+        <w:spacing w:after="0" w:line="240" w:lineRule="auto"/>
+      </w:pPr>
+      <w:r>
+        <w:separator/>
+      </w:r>
+    </w:p>
+  </w:endnote>
+  <w:endnote w:type="continuationSeparator" w:id="0">
+    <w:p>
+      <w:pPr>
+        <w:spacing w:after="0" w:line="240" w:lineRule="auto"/>
+      </w:pPr>
+      <w:r>
+        <w:continuationSeparator/>
+      </w:r>
+    </w:p>
+  </w:endnote>
+</w:endnotes>
+</file>
+
+<file path=word/footnotes.xml><?xml version="1.0" encoding="utf-8"?>
+<w:footnotes xmlns:wpc="http://schemas.microsoft.com/office/word/2010/wordprocessingCanvas" xmlns:cx="http://schemas.microsoft.com/office/drawing/2014/chartex" xmlns:cx1="http://schemas.microsoft.com/office/drawing/2015/9/8/chartex" xmlns:cx2="http://schemas.microsoft.com/office/drawing/2015/10/21/chartex" xmlns:cx3="http://schemas.microsoft.com/office/drawing/2016/5/9/chartex" xmlns:cx4="http://schemas.microsoft.com/office/drawing/2016/5/10/chartex" xmlns:cx5="http://schemas.microsoft.com/office/drawing/2016/5/11/chartex" xmlns:cx6="http://schemas.microsoft.com/office/drawing/2016/5/12/chartex" xmlns:cx7="http://schemas.microsoft.com/office/drawing/2016/5/13/chartex" xmlns:cx8="http://schemas.microsoft.com/office/drawing/2016/5/14/chartex" xmlns:mc="http://schemas.openxmlformats.org/markup-compatibility/2006" xmlns:aink="http://schemas.microsoft.com/office/drawing/2016/ink" xmlns:am3d="http://schemas.microsoft.com/office/drawing/2017/model3d" xmlns:o="urn:schemas-microsoft-com:office:office" xmlns:oel="http://schemas.microsoft.com/office/2019/extlst" xmlns:r="http://schemas.openxmlformats.org/officeDocument/2006/relationships" xmlns:m="http://schemas.openxmlformats.org/officeDocument/2006/math" xmlns:v="urn:schemas-microsoft-com:vml" xmlns:wp14="http://schemas.microsoft.com/office/word/2010/wordprocessingDrawing" xmlns:wp="http://schemas.openxmlformats.org/drawingml/2006/wordprocessingDrawing" xmlns:w10="urn:schemas-microsoft-com:office:word" xmlns:w="http://schemas.openxmlformats.org/wordprocessingml/2006/main" xmlns:w14="http://schemas.microsoft.com/office/word/2010/wordml" xmlns:w15="http://schemas.microsoft.com/office/word/2012/wordml" xmlns:w16cex="http://schemas.microsoft.com/office/word/2018/wordml/cex" xmlns:w16cid="http://schemas.microsoft.com/office/word/2016/wordml/cid" xmlns:w16="http://schemas.microsoft.com/office/word/2018/wordml" xmlns:w16du="http://schemas.microsoft.com/office/word/2023/wordml/word16du" xmlns:w16sdtdh="http://schemas.microsoft.com/office/word/2020/wordml/sdtdatahash" xmlns:w16sdtfl="http://schemas.microsoft.com/office/word/2024/wordml/sdtformatlock" xmlns:w16se="http://schemas.microsoft.com/office/word/2015/wordml/symex" xmlns:wpg="http://schemas.microsoft.com/office/word/2010/wordprocessingGroup" xmlns:wpi="http://schemas.microsoft.com/office/word/2010/wordprocessingInk" xmlns:wne="http://schemas.microsoft.com/office/word/2006/wordml" xmlns:wps="http://schemas.microsoft.com/office/word/2010/wordprocessingShape" mc:Ignorable="w14 w15 w16se w16cid w16 w16cex w16sdtdh w16sdtfl w16du wp14">
+  <w:footnote w:type="separator" w:id="-1">
+    <w:p>
+      <w:pPr>
+        <w:spacing w:after="0" w:line="240" w:lineRule="auto"/>
+      </w:pPr>
+      <w:r>
+        <w:separator/>
+      </w:r>
+    </w:p>
+  </w:footnote>
+  <w:footnote w:type="continuationSeparator" w:id="0">
+    <w:p>
+      <w:pPr>
+        <w:spacing w:after="0" w:line="240" w:lineRule="auto"/>
+      </w:pPr>
+      <w:r>
+        <w:continuationSeparator/>
+      </w:r>
+    </w:p>
+  </w:footnote>
+</w:footnotes>
 </file>
 
 <file path=word/numbering.xml><?xml version="1.0" encoding="utf-8"?>
@@ -1154,8 +1259,240 @@
       </w:rPr>
     </w:lvl>
   </w:abstractNum>
+  <w:abstractNum w:abstractNumId="1" w15:restartNumberingAfterBreak="0">
+    <w:nsid w:val="4AEC11FC"/>
+    <w:multiLevelType w:val="hybridMultilevel"/>
+    <w:tmpl w:val="43465D7E"/>
+    <w:lvl w:ilvl="0" w:tplc="08090001">
+      <w:start w:val="1"/>
+      <w:numFmt w:val="bullet"/>
+      <w:lvlText w:val=""/>
+      <w:lvlJc w:val="left"/>
+      <w:pPr>
+        <w:ind w:left="720" w:hanging="360"/>
+      </w:pPr>
+      <w:rPr>
+        <w:rFonts w:ascii="Symbol" w:hAnsi="Symbol" w:hint="default"/>
+      </w:rPr>
+    </w:lvl>
+    <w:lvl w:ilvl="1" w:tplc="08090003" w:tentative="1">
+      <w:start w:val="1"/>
+      <w:numFmt w:val="bullet"/>
+      <w:lvlText w:val="o"/>
+      <w:lvlJc w:val="left"/>
+      <w:pPr>
+        <w:ind w:left="1440" w:hanging="360"/>
+      </w:pPr>
+      <w:rPr>
+        <w:rFonts w:ascii="Courier New" w:hAnsi="Courier New" w:cs="Courier New" w:hint="default"/>
+      </w:rPr>
+    </w:lvl>
+    <w:lvl w:ilvl="2" w:tplc="08090005" w:tentative="1">
+      <w:start w:val="1"/>
+      <w:numFmt w:val="bullet"/>
+      <w:lvlText w:val=""/>
+      <w:lvlJc w:val="left"/>
+      <w:pPr>
+        <w:ind w:left="2160" w:hanging="360"/>
+      </w:pPr>
+      <w:rPr>
+        <w:rFonts w:ascii="Wingdings" w:hAnsi="Wingdings" w:hint="default"/>
+      </w:rPr>
+    </w:lvl>
+    <w:lvl w:ilvl="3" w:tplc="08090001" w:tentative="1">
+      <w:start w:val="1"/>
+      <w:numFmt w:val="bullet"/>
+      <w:lvlText w:val=""/>
+      <w:lvlJc w:val="left"/>
+      <w:pPr>
+        <w:ind w:left="2880" w:hanging="360"/>
+      </w:pPr>
+      <w:rPr>
+        <w:rFonts w:ascii="Symbol" w:hAnsi="Symbol" w:hint="default"/>
+      </w:rPr>
+    </w:lvl>
+    <w:lvl w:ilvl="4" w:tplc="08090003" w:tentative="1">
+      <w:start w:val="1"/>
+      <w:numFmt w:val="bullet"/>
+      <w:lvlText w:val="o"/>
+      <w:lvlJc w:val="left"/>
+      <w:pPr>
+        <w:ind w:left="3600" w:hanging="360"/>
+      </w:pPr>
+      <w:rPr>
+        <w:rFonts w:ascii="Courier New" w:hAnsi="Courier New" w:cs="Courier New" w:hint="default"/>
+      </w:rPr>
+    </w:lvl>
+    <w:lvl w:ilvl="5" w:tplc="08090005" w:tentative="1">
+      <w:start w:val="1"/>
+      <w:numFmt w:val="bullet"/>
+      <w:lvlText w:val=""/>
+      <w:lvlJc w:val="left"/>
+      <w:pPr>
+        <w:ind w:left="4320" w:hanging="360"/>
+      </w:pPr>
+      <w:rPr>
+        <w:rFonts w:ascii="Wingdings" w:hAnsi="Wingdings" w:hint="default"/>
+      </w:rPr>
+    </w:lvl>
+    <w:lvl w:ilvl="6" w:tplc="08090001" w:tentative="1">
+      <w:start w:val="1"/>
+      <w:numFmt w:val="bullet"/>
+      <w:lvlText w:val=""/>
+      <w:lvlJc w:val="left"/>
+      <w:pPr>
+        <w:ind w:left="5040" w:hanging="360"/>
+      </w:pPr>
+      <w:rPr>
+        <w:rFonts w:ascii="Symbol" w:hAnsi="Symbol" w:hint="default"/>
+      </w:rPr>
+    </w:lvl>
+    <w:lvl w:ilvl="7" w:tplc="08090003" w:tentative="1">
+      <w:start w:val="1"/>
+      <w:numFmt w:val="bullet"/>
+      <w:lvlText w:val="o"/>
+      <w:lvlJc w:val="left"/>
+      <w:pPr>
+        <w:ind w:left="5760" w:hanging="360"/>
+      </w:pPr>
+      <w:rPr>
+        <w:rFonts w:ascii="Courier New" w:hAnsi="Courier New" w:cs="Courier New" w:hint="default"/>
+      </w:rPr>
+    </w:lvl>
+    <w:lvl w:ilvl="8" w:tplc="08090005" w:tentative="1">
+      <w:start w:val="1"/>
+      <w:numFmt w:val="bullet"/>
+      <w:lvlText w:val=""/>
+      <w:lvlJc w:val="left"/>
+      <w:pPr>
+        <w:ind w:left="6480" w:hanging="360"/>
+      </w:pPr>
+      <w:rPr>
+        <w:rFonts w:ascii="Wingdings" w:hAnsi="Wingdings" w:hint="default"/>
+      </w:rPr>
+    </w:lvl>
+  </w:abstractNum>
+  <w:abstractNum w:abstractNumId="2" w15:restartNumberingAfterBreak="0">
+    <w:nsid w:val="73567C68"/>
+    <w:multiLevelType w:val="hybridMultilevel"/>
+    <w:tmpl w:val="F1E0B1BC"/>
+    <w:lvl w:ilvl="0" w:tplc="08090001">
+      <w:start w:val="1"/>
+      <w:numFmt w:val="bullet"/>
+      <w:lvlText w:val=""/>
+      <w:lvlJc w:val="left"/>
+      <w:pPr>
+        <w:ind w:left="720" w:hanging="360"/>
+      </w:pPr>
+      <w:rPr>
+        <w:rFonts w:ascii="Symbol" w:hAnsi="Symbol" w:hint="default"/>
+      </w:rPr>
+    </w:lvl>
+    <w:lvl w:ilvl="1" w:tplc="08090003" w:tentative="1">
+      <w:start w:val="1"/>
+      <w:numFmt w:val="bullet"/>
+      <w:lvlText w:val="o"/>
+      <w:lvlJc w:val="left"/>
+      <w:pPr>
+        <w:ind w:left="1440" w:hanging="360"/>
+      </w:pPr>
+      <w:rPr>
+        <w:rFonts w:ascii="Courier New" w:hAnsi="Courier New" w:cs="Courier New" w:hint="default"/>
+      </w:rPr>
+    </w:lvl>
+    <w:lvl w:ilvl="2" w:tplc="08090005" w:tentative="1">
+      <w:start w:val="1"/>
+      <w:numFmt w:val="bullet"/>
+      <w:lvlText w:val=""/>
+      <w:lvlJc w:val="left"/>
+      <w:pPr>
+        <w:ind w:left="2160" w:hanging="360"/>
+      </w:pPr>
+      <w:rPr>
+        <w:rFonts w:ascii="Wingdings" w:hAnsi="Wingdings" w:hint="default"/>
+      </w:rPr>
+    </w:lvl>
+    <w:lvl w:ilvl="3" w:tplc="08090001" w:tentative="1">
+      <w:start w:val="1"/>
+      <w:numFmt w:val="bullet"/>
+      <w:lvlText w:val=""/>
+      <w:lvlJc w:val="left"/>
+      <w:pPr>
+        <w:ind w:left="2880" w:hanging="360"/>
+      </w:pPr>
+      <w:rPr>
+        <w:rFonts w:ascii="Symbol" w:hAnsi="Symbol" w:hint="default"/>
+      </w:rPr>
+    </w:lvl>
+    <w:lvl w:ilvl="4" w:tplc="08090003" w:tentative="1">
+      <w:start w:val="1"/>
+      <w:numFmt w:val="bullet"/>
+      <w:lvlText w:val="o"/>
+      <w:lvlJc w:val="left"/>
+      <w:pPr>
+        <w:ind w:left="3600" w:hanging="360"/>
+      </w:pPr>
+      <w:rPr>
+        <w:rFonts w:ascii="Courier New" w:hAnsi="Courier New" w:cs="Courier New" w:hint="default"/>
+      </w:rPr>
+    </w:lvl>
+    <w:lvl w:ilvl="5" w:tplc="08090005" w:tentative="1">
+      <w:start w:val="1"/>
+      <w:numFmt w:val="bullet"/>
+      <w:lvlText w:val=""/>
+      <w:lvlJc w:val="left"/>
+      <w:pPr>
+        <w:ind w:left="4320" w:hanging="360"/>
+      </w:pPr>
+      <w:rPr>
+        <w:rFonts w:ascii="Wingdings" w:hAnsi="Wingdings" w:hint="default"/>
+      </w:rPr>
+    </w:lvl>
+    <w:lvl w:ilvl="6" w:tplc="08090001" w:tentative="1">
+      <w:start w:val="1"/>
+      <w:numFmt w:val="bullet"/>
+      <w:lvlText w:val=""/>
+      <w:lvlJc w:val="left"/>
+      <w:pPr>
+        <w:ind w:left="5040" w:hanging="360"/>
+      </w:pPr>
+      <w:rPr>
+        <w:rFonts w:ascii="Symbol" w:hAnsi="Symbol" w:hint="default"/>
+      </w:rPr>
+    </w:lvl>
+    <w:lvl w:ilvl="7" w:tplc="08090003" w:tentative="1">
+      <w:start w:val="1"/>
+      <w:numFmt w:val="bullet"/>
+      <w:lvlText w:val="o"/>
+      <w:lvlJc w:val="left"/>
+      <w:pPr>
+        <w:ind w:left="5760" w:hanging="360"/>
+      </w:pPr>
+      <w:rPr>
+        <w:rFonts w:ascii="Courier New" w:hAnsi="Courier New" w:cs="Courier New" w:hint="default"/>
+      </w:rPr>
+    </w:lvl>
+    <w:lvl w:ilvl="8" w:tplc="08090005" w:tentative="1">
+      <w:start w:val="1"/>
+      <w:numFmt w:val="bullet"/>
+      <w:lvlText w:val=""/>
+      <w:lvlJc w:val="left"/>
+      <w:pPr>
+        <w:ind w:left="6480" w:hanging="360"/>
+      </w:pPr>
+      <w:rPr>
+        <w:rFonts w:ascii="Wingdings" w:hAnsi="Wingdings" w:hint="default"/>
+      </w:rPr>
+    </w:lvl>
+  </w:abstractNum>
   <w:num w:numId="1" w16cid:durableId="206992485">
     <w:abstractNumId w:val="0"/>
+  </w:num>
+  <w:num w:numId="2" w16cid:durableId="2099018508">
+    <w:abstractNumId w:val="1"/>
+  </w:num>
+  <w:num w:numId="3" w16cid:durableId="2012176786">
+    <w:abstractNumId w:val="2"/>
   </w:num>
 </w:numbering>
 </file>
@@ -1592,7 +1929,6 @@
     <w:next w:val="Normal"/>
     <w:link w:val="Heading2Char"/>
     <w:uiPriority w:val="9"/>
-    <w:semiHidden/>
     <w:unhideWhenUsed/>
     <w:qFormat/>
     <w:rsid w:val="00093A57"/>
@@ -1810,7 +2146,6 @@
     <w:basedOn w:val="DefaultParagraphFont"/>
     <w:link w:val="Heading2"/>
     <w:uiPriority w:val="9"/>
-    <w:semiHidden/>
     <w:qFormat/>
     <w:rsid w:val="00093A57"/>
     <w:rPr>
@@ -2209,6 +2544,79 @@
     <w:rsid w:val="002657A6"/>
     <w:rPr>
       <w:color w:val="666666"/>
+    </w:rPr>
+  </w:style>
+  <w:style w:type="paragraph" w:styleId="Header">
+    <w:name w:val="header"/>
+    <w:basedOn w:val="Normal"/>
+    <w:link w:val="HeaderChar"/>
+    <w:uiPriority w:val="99"/>
+    <w:unhideWhenUsed/>
+    <w:rsid w:val="00DA4409"/>
+    <w:pPr>
+      <w:tabs>
+        <w:tab w:val="center" w:pos="4513"/>
+        <w:tab w:val="right" w:pos="9026"/>
+      </w:tabs>
+      <w:spacing w:after="0" w:line="240" w:lineRule="auto"/>
+    </w:pPr>
+  </w:style>
+  <w:style w:type="character" w:customStyle="1" w:styleId="HeaderChar">
+    <w:name w:val="Header Char"/>
+    <w:basedOn w:val="DefaultParagraphFont"/>
+    <w:link w:val="Header"/>
+    <w:uiPriority w:val="99"/>
+    <w:rsid w:val="00DA4409"/>
+  </w:style>
+  <w:style w:type="paragraph" w:styleId="Footer">
+    <w:name w:val="footer"/>
+    <w:basedOn w:val="Normal"/>
+    <w:link w:val="FooterChar"/>
+    <w:uiPriority w:val="99"/>
+    <w:unhideWhenUsed/>
+    <w:rsid w:val="00DA4409"/>
+    <w:pPr>
+      <w:tabs>
+        <w:tab w:val="center" w:pos="4513"/>
+        <w:tab w:val="right" w:pos="9026"/>
+      </w:tabs>
+      <w:spacing w:after="0" w:line="240" w:lineRule="auto"/>
+    </w:pPr>
+  </w:style>
+  <w:style w:type="character" w:customStyle="1" w:styleId="FooterChar">
+    <w:name w:val="Footer Char"/>
+    <w:basedOn w:val="DefaultParagraphFont"/>
+    <w:link w:val="Footer"/>
+    <w:uiPriority w:val="99"/>
+    <w:rsid w:val="00DA4409"/>
+  </w:style>
+  <w:style w:type="paragraph" w:styleId="NoSpacing">
+    <w:name w:val="No Spacing"/>
+    <w:link w:val="NoSpacingChar"/>
+    <w:uiPriority w:val="1"/>
+    <w:qFormat/>
+    <w:rsid w:val="00D03CAE"/>
+    <w:pPr>
+      <w:suppressAutoHyphens w:val="0"/>
+    </w:pPr>
+    <w:rPr>
+      <w:rFonts w:eastAsiaTheme="minorEastAsia"/>
+      <w:kern w:val="0"/>
+      <w:lang w:val="en-US"/>
+      <w14:ligatures w14:val="none"/>
+    </w:rPr>
+  </w:style>
+  <w:style w:type="character" w:customStyle="1" w:styleId="NoSpacingChar">
+    <w:name w:val="No Spacing Char"/>
+    <w:basedOn w:val="DefaultParagraphFont"/>
+    <w:link w:val="NoSpacing"/>
+    <w:uiPriority w:val="1"/>
+    <w:rsid w:val="00D03CAE"/>
+    <w:rPr>
+      <w:rFonts w:eastAsiaTheme="minorEastAsia"/>
+      <w:kern w:val="0"/>
+      <w:lang w:val="en-US"/>
+      <w14:ligatures w14:val="none"/>
     </w:rPr>
   </w:style>
 </w:styles>

</xml_diff>